<commit_message>
Refresh portfolio from master CV
</commit_message>
<xml_diff>
--- a/artifacts/Nicole_Nikareayi_Public_CV.docx
+++ b/artifacts/Nicole_Nikareayi_Public_CV.docx
@@ -144,7 +144,7 @@
           <w:color w:val="1F2B31"/>
           <w:sz w:val="18"/>
         </w:rPr>
-        <w:t>Master of Technology Innovation in Business graduate with Distinction and practical experience translating stakeholder needs into requirements, workflows, structured data, prototypes and functional digital products. Brings hands-on experience in platform evaluation, testing, documentation, data organisation and iterative process improvement across internship, academic and independently built projects.</w:t>
+        <w:t>Graduate business systems and technology professional with a Master of Technology Innovation in Business (Distinction) and practical experience across an approximately 400-hour academic internship, requirements and process analysis, application testing, data organisation, stakeholder documentation and privacy-conscious digital products.</w:t>
       </w:r>
     </w:p>
     <w:p>
@@ -159,7 +159,7 @@
           <w:color w:val="1F2B31"/>
           <w:sz w:val="18"/>
         </w:rPr>
-        <w:t>Targeting graduate and junior opportunities across business analysis, business systems, application support, implementation coordination, functional consulting, master data, data quality, reporting and continuous improvement.</w:t>
+        <w:t>Combines business, systems, data, AI and user-centred design capability. Targeting graduate and junior opportunities across business analysis, business systems, implementation, application support, data quality, reporting and continuous improvement.</w:t>
       </w:r>
     </w:p>
     <w:p>
@@ -191,7 +191,7 @@
           <w:color w:val="1F2B31"/>
           <w:sz w:val="18"/>
         </w:rPr>
-        <w:t>Business analysis: requirements gathering, stakeholder communication, process mapping, gap analysis, user stories and functional requirements. Systems and implementation: platform evaluation, workflow modelling, testing coordination, feedback triage and documentation. Data and reporting: data cleaning, validation, structured records, lookups, pivot tables and dashboard design. Improvement: issue identification, workflow optimisation and iterative refinement.</w:t>
+        <w:t>Business analysis: requirements, user stories, process and workflow mapping, gap and option analysis. Systems and implementation: solution evaluation, testing, issue tracking, user guidance and documentation. Data and reporting: collection, cleaning, validation, reconciliation, Excel analysis, dashboards and structured records. Improvement: user research, accessibility testing, feedback synthesis and workflow refinement.</w:t>
       </w:r>
     </w:p>
     <w:p>
@@ -234,7 +234,7 @@
           <w:color w:val="1F2B31"/>
           <w:sz w:val="18"/>
         </w:rPr>
-        <w:t xml:space="preserve"> | University of Waikato (STEMX500)</w:t>
+        <w:t xml:space="preserve"> | University of Waikato | Academic, A+</w:t>
       </w:r>
       <w:r>
         <w:rPr>
@@ -244,7 +244,7 @@
           <w:color w:val="4C6572"/>
           <w:sz w:val="18"/>
         </w:rPr>
-        <w:t xml:space="preserve"> | Nov 2025 - Feb 2026 | 400+ hours</w:t>
+        <w:t xml:space="preserve"> | Nov 2025 - Feb 2026 | Approximately 400 hours</w:t>
       </w:r>
     </w:p>
     <w:p>
@@ -262,7 +262,7 @@
           <w:color w:val="1F2B31"/>
           <w:sz w:val="17"/>
         </w:rPr>
-        <w:t>Translated project objectives and stakeholder needs into user journeys, interaction flows and functional requirements for an interactive cultural storytelling experience.</w:t>
+        <w:t>Helped a student team deliver Ko ahau te awa, an interactive cultural storytelling prototype combining a map, puzzle interaction, responsive layouts and optional audio narration.</w:t>
       </w:r>
     </w:p>
     <w:p>
@@ -280,7 +280,7 @@
           <w:color w:val="1F2B31"/>
           <w:sz w:val="17"/>
         </w:rPr>
-        <w:t>Built and refined a responsive Wix prototype across desktop and mobile, using structured platform evaluation to resolve implementation constraints.</w:t>
+        <w:t>Translated project goals and feedback into user journeys, interaction flows, functional requirements and structured delivery tasks; owned the puzzle interaction from concept through refinement.</w:t>
       </w:r>
     </w:p>
     <w:p>
@@ -298,7 +298,7 @@
           <w:color w:val="1F2B31"/>
           <w:sz w:val="17"/>
         </w:rPr>
-        <w:t>Applied usability and accessibility principles, including clarity-first interaction, cognitive-load reduction and intuitive navigation.</w:t>
+        <w:t>Compared Wix and Canva constraints, supported responsive Wix implementation across desktop and mobile, and applied clarity, accessibility and cognitive-load principles.</w:t>
       </w:r>
     </w:p>
     <w:p>
@@ -316,7 +316,7 @@
           <w:color w:val="1F2B31"/>
           <w:sz w:val="17"/>
         </w:rPr>
-        <w:t>Coordinated testing, feedback synthesis and iterative refinement; delivered the final prototype, documentation and presentation.</w:t>
+        <w:t>Supported testing, issue identification and repeated correction; maintained project records and helped deliver the final prototype, report and presentation on schedule.</w:t>
       </w:r>
     </w:p>
     <w:p>
@@ -333,7 +333,7 @@
           <w:color w:val="007E80"/>
           <w:sz w:val="21"/>
         </w:rPr>
-        <w:t>SELECTED DIGITAL PROJECTS</w:t>
+        <w:t>SELECTED BUSINESS SYSTEMS PROJECTS</w:t>
       </w:r>
     </w:p>
     <w:p>
@@ -387,7 +387,7 @@
           <w:color w:val="1F2B31"/>
           <w:sz w:val="17"/>
         </w:rPr>
-        <w:t>Defined requirements, workflow stages, status categories and information architecture for managing job applications and follow-up actions.</w:t>
+        <w:t>Defined business rules, data fields, status categories, workflows and information architecture for centralising applications, candidate portals and follow-up information.</w:t>
       </w:r>
     </w:p>
     <w:p>
@@ -405,7 +405,7 @@
           <w:color w:val="1F2B31"/>
           <w:sz w:val="17"/>
         </w:rPr>
-        <w:t>Designed dashboard analytics, filtering, sorting and structured records; implemented local backup, restore and privacy-safe demo data.</w:t>
+        <w:t>Built dashboard metrics, conversion indicators, search, A-Z navigation, filtering, sorting, grouping and responsive record management.</w:t>
       </w:r>
     </w:p>
     <w:p>
@@ -423,7 +423,209 @@
           <w:color w:val="1F2B31"/>
           <w:sz w:val="17"/>
         </w:rPr>
-        <w:t>Iteratively tested and refined the responsive interface using real-world workflow needs.</w:t>
+        <w:t>Implemented Google authentication and user-scoped Supabase access for the private version; separated the public demo with fictional records, simulated sign-in and disabled cloud access.</w:t>
+      </w:r>
+    </w:p>
+    <w:p>
+      <w:pPr>
+        <w:keepNext/>
+        <w:spacing w:before="80" w:after="20" w:line="240" w:lineRule="auto"/>
+      </w:pPr>
+      <w:r>
+        <w:rPr>
+          <w:rFonts w:ascii="Arial" w:hAnsi="Arial"/>
+          <w:b/>
+          <w:i w:val="0"/>
+          <w:color w:val="12384A"/>
+          <w:sz w:val="20"/>
+        </w:rPr>
+        <w:t>Ana Tilim - Mobile-First Uyghur Language Learning Platform</w:t>
+      </w:r>
+      <w:r>
+        <w:rPr>
+          <w:rFonts w:ascii="Arial" w:hAnsi="Arial"/>
+          <w:b w:val="0"/>
+          <w:i w:val="0"/>
+          <w:color w:val="1F2B31"/>
+          <w:sz w:val="18"/>
+        </w:rPr>
+        <w:t xml:space="preserve"> | Independent project</w:t>
+      </w:r>
+      <w:r>
+        <w:rPr>
+          <w:rFonts w:ascii="Arial" w:hAnsi="Arial"/>
+          <w:b w:val="0"/>
+          <w:i/>
+          <w:color w:val="4C6572"/>
+          <w:sz w:val="18"/>
+        </w:rPr>
+        <w:t xml:space="preserve"> | Jul 2026 - Present</w:t>
+      </w:r>
+    </w:p>
+    <w:p>
+      <w:pPr>
+        <w:pStyle w:val="ListBullet"/>
+        <w:keepLines/>
+        <w:spacing w:before="0" w:after="30" w:line="250" w:lineRule="auto"/>
+        <w:ind w:left="288" w:hanging="187"/>
+      </w:pPr>
+      <w:r>
+        <w:rPr>
+          <w:rFonts w:ascii="Arial" w:hAnsi="Arial"/>
+          <w:b w:val="0"/>
+          <w:i w:val="0"/>
+          <w:color w:val="1F2B31"/>
+          <w:sz w:val="17"/>
+        </w:rPr>
+        <w:t>Structured multilingual curriculum and course data for Uyghur script, ULY transliteration, vocabulary, grammar, practice activities and reading content.</w:t>
+      </w:r>
+    </w:p>
+    <w:p>
+      <w:pPr>
+        <w:pStyle w:val="ListBullet"/>
+        <w:keepLines/>
+        <w:spacing w:before="0" w:after="30" w:line="250" w:lineRule="auto"/>
+        <w:ind w:left="288" w:hanging="187"/>
+      </w:pPr>
+      <w:r>
+        <w:rPr>
+          <w:rFonts w:ascii="Arial" w:hAnsi="Arial"/>
+          <w:b w:val="0"/>
+          <w:i w:val="0"/>
+          <w:color w:val="1F2B31"/>
+          <w:sz w:val="17"/>
+        </w:rPr>
+        <w:t>Implemented RTL support, human-recorded audio, listening and dictation, offline progress, backup and restore, plus UID-scoped Supabase synchronisation with Row Level Security.</w:t>
+      </w:r>
+    </w:p>
+    <w:p>
+      <w:pPr>
+        <w:pStyle w:val="ListBullet"/>
+        <w:keepLines/>
+        <w:spacing w:before="0" w:after="30" w:line="250" w:lineRule="auto"/>
+        <w:ind w:left="288" w:hanging="187"/>
+      </w:pPr>
+      <w:r>
+        <w:rPr>
+          <w:rFonts w:ascii="Arial" w:hAnsi="Arial"/>
+          <w:b w:val="0"/>
+          <w:i w:val="0"/>
+          <w:color w:val="1F2B31"/>
+          <w:sz w:val="17"/>
+        </w:rPr>
+        <w:t>Created a verification runner covering course-data integrity, transliteration, audio manifests, interactions, authentication, cloud sync and full-content rendering across 464 interface states.</w:t>
+      </w:r>
+    </w:p>
+    <w:p>
+      <w:r>
+        <w:br w:type="page"/>
+      </w:r>
+    </w:p>
+    <w:p>
+      <w:pPr>
+        <w:pStyle w:val="Heading1"/>
+        <w:keepNext/>
+        <w:spacing w:before="160" w:after="60"/>
+      </w:pPr>
+      <w:r>
+        <w:rPr>
+          <w:rFonts w:ascii="Arial" w:hAnsi="Arial"/>
+          <w:b/>
+          <w:i w:val="0"/>
+          <w:color w:val="007E80"/>
+          <w:sz w:val="21"/>
+        </w:rPr>
+        <w:t>SELECTED DATA AND APPLICATION PROJECTS</w:t>
+      </w:r>
+    </w:p>
+    <w:p>
+      <w:pPr>
+        <w:keepNext/>
+        <w:spacing w:before="80" w:after="20" w:line="240" w:lineRule="auto"/>
+      </w:pPr>
+      <w:r>
+        <w:rPr>
+          <w:rFonts w:ascii="Arial" w:hAnsi="Arial"/>
+          <w:b/>
+          <w:i w:val="0"/>
+          <w:color w:val="12384A"/>
+          <w:sz w:val="20"/>
+        </w:rPr>
+        <w:t>Harry Potter Knowledge Assistant - Curated AI Dataset</w:t>
+      </w:r>
+      <w:r>
+        <w:rPr>
+          <w:rFonts w:ascii="Arial" w:hAnsi="Arial"/>
+          <w:b w:val="0"/>
+          <w:i w:val="0"/>
+          <w:color w:val="1F2B31"/>
+          <w:sz w:val="18"/>
+        </w:rPr>
+        <w:t xml:space="preserve"> | COMPX500 | A+</w:t>
+      </w:r>
+      <w:r>
+        <w:rPr>
+          <w:rFonts w:ascii="Arial" w:hAnsi="Arial"/>
+          <w:b w:val="0"/>
+          <w:i/>
+          <w:color w:val="4C6572"/>
+          <w:sz w:val="18"/>
+        </w:rPr>
+        <w:t xml:space="preserve"> | Aug 2025 - Sep 2025</w:t>
+      </w:r>
+    </w:p>
+    <w:p>
+      <w:pPr>
+        <w:pStyle w:val="ListBullet"/>
+        <w:keepLines/>
+        <w:spacing w:before="0" w:after="30" w:line="250" w:lineRule="auto"/>
+        <w:ind w:left="288" w:hanging="187"/>
+      </w:pPr>
+      <w:r>
+        <w:rPr>
+          <w:rFonts w:ascii="Arial" w:hAnsi="Arial"/>
+          <w:b w:val="0"/>
+          <w:i w:val="0"/>
+          <w:color w:val="1F2B31"/>
+          <w:sz w:val="17"/>
+        </w:rPr>
+        <w:t>Collected and integrated data from Wikipedia, Kaggle and Fandom using Python, BeautifulSoup, Pandas, Google Colab and Jupyter Notebook.</w:t>
+      </w:r>
+    </w:p>
+    <w:p>
+      <w:pPr>
+        <w:pStyle w:val="ListBullet"/>
+        <w:keepLines/>
+        <w:spacing w:before="0" w:after="30" w:line="250" w:lineRule="auto"/>
+        <w:ind w:left="288" w:hanging="187"/>
+      </w:pPr>
+      <w:r>
+        <w:rPr>
+          <w:rFonts w:ascii="Arial" w:hAnsi="Arial"/>
+          <w:b w:val="0"/>
+          <w:i w:val="0"/>
+          <w:color w:val="1F2B31"/>
+          <w:sz w:val="17"/>
+        </w:rPr>
+        <w:t>Cleaned schemas, removed duplicates, managed aliases, linked subjects and expanded the validated dataset to 16,245 rows.</w:t>
+      </w:r>
+    </w:p>
+    <w:p>
+      <w:pPr>
+        <w:pStyle w:val="ListBullet"/>
+        <w:keepLines/>
+        <w:spacing w:before="0" w:after="30" w:line="250" w:lineRule="auto"/>
+        <w:ind w:left="288" w:hanging="187"/>
+      </w:pPr>
+      <w:r>
+        <w:rPr>
+          <w:rFonts w:ascii="Arial" w:hAnsi="Arial"/>
+          <w:b w:val="0"/>
+          <w:i w:val="0"/>
+          <w:color w:val="1F2B31"/>
+          <w:sz w:val="17"/>
+        </w:rPr>
+        <w:t>Packaged a constrained upload bundle with a manifest and validation checks; designed source-aware, off-topic and uncertainty handling and compared cloud/local model results.</w:t>
       </w:r>
     </w:p>
     <w:p>
@@ -477,7 +679,7 @@
           <w:color w:val="1F2B31"/>
           <w:sz w:val="17"/>
         </w:rPr>
-        <w:t>Defined a mobile-first cash-planning workflow covering income, recurring expenses, estimated utilities and projected balances.</w:t>
+        <w:t>Translated cash-planning needs into editable profile and transaction models, recurring costs, income, safety thresholds and projected balances.</w:t>
       </w:r>
     </w:p>
     <w:p>
@@ -495,65 +697,7 @@
           <w:color w:val="1F2B31"/>
           <w:sz w:val="17"/>
         </w:rPr>
-        <w:t>Designed the responsive dashboard and implemented Firebase Authentication, private Firestore synchronisation and a public Demo mode.</w:t>
-      </w:r>
-    </w:p>
-    <w:p>
-      <w:r>
-        <w:br w:type="page"/>
-      </w:r>
-    </w:p>
-    <w:p>
-      <w:pPr>
-        <w:pStyle w:val="Heading1"/>
-        <w:keepNext/>
-        <w:spacing w:before="160" w:after="60"/>
-      </w:pPr>
-      <w:r>
-        <w:rPr>
-          <w:rFonts w:ascii="Arial" w:hAnsi="Arial"/>
-          <w:b/>
-          <w:i w:val="0"/>
-          <w:color w:val="007E80"/>
-          <w:sz w:val="21"/>
-        </w:rPr>
-        <w:t>SELECTED UNIVERSITY PROJECTS</w:t>
-      </w:r>
-    </w:p>
-    <w:p>
-      <w:pPr>
-        <w:keepNext/>
-        <w:spacing w:before="80" w:after="20" w:line="240" w:lineRule="auto"/>
-      </w:pPr>
-      <w:r>
-        <w:rPr>
-          <w:rFonts w:ascii="Arial" w:hAnsi="Arial"/>
-          <w:b/>
-          <w:i w:val="0"/>
-          <w:color w:val="12384A"/>
-          <w:sz w:val="20"/>
-        </w:rPr>
-        <w:t>PawPal Health - AI-enabled Dog Wellbeing Concept</w:t>
-      </w:r>
-      <w:r>
-        <w:rPr>
-          <w:rFonts w:ascii="Arial" w:hAnsi="Arial"/>
-          <w:b w:val="0"/>
-          <w:i w:val="0"/>
-          <w:color w:val="1F2B31"/>
-          <w:sz w:val="18"/>
-        </w:rPr>
-        <w:t xml:space="preserve"> | University of Waikato (COMPX500)</w:t>
-      </w:r>
-      <w:r>
-        <w:rPr>
-          <w:rFonts w:ascii="Arial" w:hAnsi="Arial"/>
-          <w:b w:val="0"/>
-          <w:i/>
-          <w:color w:val="4C6572"/>
-          <w:sz w:val="18"/>
-        </w:rPr>
-        <w:t xml:space="preserve"> | Sep 2025 - Oct 2025</w:t>
+        <w:t>Implemented Firebase Authentication and UID-scoped Firestore storage, with a local Demo mode and explicit separation between local and authenticated cloud states.</w:t>
       </w:r>
     </w:p>
     <w:p>
@@ -571,115 +715,7 @@
           <w:color w:val="1F2B31"/>
           <w:sz w:val="17"/>
         </w:rPr>
-        <w:t>Translated pet-owner needs into feature requirements for activity tracking, symptom monitoring, wellbeing insights and AI-assisted feedback.</w:t>
-      </w:r>
-    </w:p>
-    <w:p>
-      <w:pPr>
-        <w:pStyle w:val="ListBullet"/>
-        <w:keepLines/>
-        <w:spacing w:before="0" w:after="30" w:line="250" w:lineRule="auto"/>
-        <w:ind w:left="288" w:hanging="187"/>
-      </w:pPr>
-      <w:r>
-        <w:rPr>
-          <w:rFonts w:ascii="Arial" w:hAnsi="Arial"/>
-          <w:b w:val="0"/>
-          <w:i w:val="0"/>
-          <w:color w:val="1F2B31"/>
-          <w:sz w:val="17"/>
-        </w:rPr>
-        <w:t>Designed a dashboard that presents behavioural and physiological information clearly and created interactive prototype screens in Proto.io.</w:t>
-      </w:r>
-    </w:p>
-    <w:p>
-      <w:pPr>
-        <w:pStyle w:val="ListBullet"/>
-        <w:keepLines/>
-        <w:spacing w:before="0" w:after="30" w:line="250" w:lineRule="auto"/>
-        <w:ind w:left="288" w:hanging="187"/>
-      </w:pPr>
-      <w:r>
-        <w:rPr>
-          <w:rFonts w:ascii="Arial" w:hAnsi="Arial"/>
-          <w:b w:val="0"/>
-          <w:i w:val="0"/>
-          <w:color w:val="1F2B31"/>
-          <w:sz w:val="17"/>
-        </w:rPr>
-        <w:t>Presented the product concept, user value, design rationale and innovation opportunity.</w:t>
-      </w:r>
-    </w:p>
-    <w:p>
-      <w:pPr>
-        <w:keepNext/>
-        <w:spacing w:before="80" w:after="20" w:line="240" w:lineRule="auto"/>
-      </w:pPr>
-      <w:r>
-        <w:rPr>
-          <w:rFonts w:ascii="Arial" w:hAnsi="Arial"/>
-          <w:b/>
-          <w:i w:val="0"/>
-          <w:color w:val="12384A"/>
-          <w:sz w:val="20"/>
-        </w:rPr>
-        <w:t>GlobeMate - Personalised Travel Planning Concept</w:t>
-      </w:r>
-      <w:r>
-        <w:rPr>
-          <w:rFonts w:ascii="Arial" w:hAnsi="Arial"/>
-          <w:b w:val="0"/>
-          <w:i w:val="0"/>
-          <w:color w:val="1F2B31"/>
-          <w:sz w:val="18"/>
-        </w:rPr>
-        <w:t xml:space="preserve"> | University of Waikato (MNMGT544)</w:t>
-      </w:r>
-      <w:r>
-        <w:rPr>
-          <w:rFonts w:ascii="Arial" w:hAnsi="Arial"/>
-          <w:b w:val="0"/>
-          <w:i/>
-          <w:color w:val="4C6572"/>
-          <w:sz w:val="18"/>
-        </w:rPr>
-        <w:t xml:space="preserve"> | Jul 2025 - Oct 2025</w:t>
-      </w:r>
-    </w:p>
-    <w:p>
-      <w:pPr>
-        <w:pStyle w:val="ListBullet"/>
-        <w:keepLines/>
-        <w:spacing w:before="0" w:after="30" w:line="250" w:lineRule="auto"/>
-        <w:ind w:left="288" w:hanging="187"/>
-      </w:pPr>
-      <w:r>
-        <w:rPr>
-          <w:rFonts w:ascii="Arial" w:hAnsi="Arial"/>
-          <w:b w:val="0"/>
-          <w:i w:val="0"/>
-          <w:color w:val="1F2B31"/>
-          <w:sz w:val="17"/>
-        </w:rPr>
-        <w:t>Conducted market research and customer segmentation for a travel concept combining weather insight, budget estimation and memory mapping.</w:t>
-      </w:r>
-    </w:p>
-    <w:p>
-      <w:pPr>
-        <w:pStyle w:val="ListBullet"/>
-        <w:keepLines/>
-        <w:spacing w:before="0" w:after="30" w:line="250" w:lineRule="auto"/>
-        <w:ind w:left="288" w:hanging="187"/>
-      </w:pPr>
-      <w:r>
-        <w:rPr>
-          <w:rFonts w:ascii="Arial" w:hAnsi="Arial"/>
-          <w:b w:val="0"/>
-          <w:i w:val="0"/>
-          <w:color w:val="1F2B31"/>
-          <w:sz w:val="17"/>
-        </w:rPr>
-        <w:t>Shaped feature logic and the value proposition, contributing to business-case development and concept validation in a multidisciplinary team.</w:t>
+        <w:t>Delivered a responsive Progressive Web App and a separate local SwiftUI companion prototype with JSON-backed on-device persistence.</w:t>
       </w:r>
     </w:p>
     <w:p>
@@ -857,7 +893,43 @@
           <w:color w:val="4C6572"/>
           <w:sz w:val="18"/>
         </w:rPr>
-        <w:t xml:space="preserve"> | Feb 2025 - Feb 2026</w:t>
+        <w:t xml:space="preserve"> | 2025 - 2026</w:t>
+      </w:r>
+    </w:p>
+    <w:p>
+      <w:pPr>
+        <w:keepNext/>
+        <w:spacing w:before="80" w:after="20" w:line="240" w:lineRule="auto"/>
+      </w:pPr>
+      <w:r>
+        <w:rPr>
+          <w:rFonts w:ascii="Arial" w:hAnsi="Arial"/>
+          <w:b/>
+          <w:i w:val="0"/>
+          <w:color w:val="12384A"/>
+          <w:sz w:val="20"/>
+        </w:rPr>
+        <w:t>Certificates of Attainment in Academic English - Levels 7 and 8</w:t>
+      </w:r>
+      <w:r>
+        <w:rPr>
+          <w:rFonts w:ascii="Arial" w:hAnsi="Arial"/>
+          <w:b w:val="0"/>
+          <w:i w:val="0"/>
+          <w:color w:val="1F2B31"/>
+          <w:sz w:val="18"/>
+        </w:rPr>
+        <w:t xml:space="preserve"> | University of Waikato, New Zealand</w:t>
+      </w:r>
+      <w:r>
+        <w:rPr>
+          <w:rFonts w:ascii="Arial" w:hAnsi="Arial"/>
+          <w:b w:val="0"/>
+          <w:i/>
+          <w:color w:val="4C6572"/>
+          <w:sz w:val="18"/>
+        </w:rPr>
+        <w:t xml:space="preserve"> | 2024 - 2025</w:t>
       </w:r>
     </w:p>
     <w:p>
@@ -893,7 +965,7 @@
           <w:color w:val="4C6572"/>
           <w:sz w:val="18"/>
         </w:rPr>
-        <w:t xml:space="preserve"> | Sep 2020 - Jul 2024</w:t>
+        <w:t xml:space="preserve"> | 2020 - 2024</w:t>
       </w:r>
     </w:p>
     <w:p>
@@ -925,7 +997,7 @@
           <w:color w:val="1F2B31"/>
           <w:sz w:val="18"/>
         </w:rPr>
-        <w:t>Business systems and data: Excel data cleaning, sorting, filtering, basic formulas, lookup functions and pivot tables; Word documentation; PowerPoint reporting and presentations. Analysis and design: Figma, Miro, Proto.io, Wix, Jira and Confluence (basic exposure). Web and data tools: HTML, CSS, JavaScript, Firebase, Firestore, GitHub, basic Python and Jupyter Notebook.</w:t>
+        <w:t>Analysis and reporting: requirements analysis, process maps, functional specifications, test support, Excel cleaning, formulas, lookups, pivot tables, validation, reconciliation and dashboard metrics. Product and web: Figma, Miro, Wix, HTML, CSS, JavaScript, PWA, Electron, SwiftUI prototypes, Firebase, Firestore, Supabase and RLS. AI and data: Python, Pandas, Jupyter, Google Colab, BeautifulSoup, curated datasets and cloud/local LLM evaluation. Tools: Microsoft 365, GitHub, Jira and Confluence (basic), SQL and Power BI (foundational).</w:t>
       </w:r>
     </w:p>
     <w:p>
@@ -947,6 +1019,38 @@
     </w:p>
     <w:p>
       <w:pPr>
+        <w:spacing w:before="0" w:after="40" w:line="259" w:lineRule="auto"/>
+      </w:pPr>
+      <w:r>
+        <w:rPr>
+          <w:rFonts w:ascii="Arial" w:hAnsi="Arial"/>
+          <w:b w:val="0"/>
+          <w:i w:val="0"/>
+          <w:color w:val="1F2B31"/>
+          <w:sz w:val="18"/>
+        </w:rPr>
+        <w:t>Uyghur - native | Mandarin Chinese - native | English - professional working proficiency | Korean - basic conversational | Te Reo Maori - introductory</w:t>
+      </w:r>
+    </w:p>
+    <w:p>
+      <w:pPr>
+        <w:pStyle w:val="Heading1"/>
+        <w:keepNext/>
+        <w:spacing w:before="160" w:after="60"/>
+      </w:pPr>
+      <w:r>
+        <w:rPr>
+          <w:rFonts w:ascii="Arial" w:hAnsi="Arial"/>
+          <w:b/>
+          <w:i w:val="0"/>
+          <w:color w:val="007E80"/>
+          <w:sz w:val="21"/>
+        </w:rPr>
+        <w:t>ADDITIONAL INFORMATION</w:t>
+      </w:r>
+    </w:p>
+    <w:p>
+      <w:pPr>
         <w:spacing w:before="0" w:after="0" w:line="259" w:lineRule="auto"/>
       </w:pPr>
       <w:r>
@@ -957,7 +1061,7 @@
           <w:color w:val="1F2B31"/>
           <w:sz w:val="18"/>
         </w:rPr>
-        <w:t>Uyghur - native | Mandarin Chinese - native | English - professional working proficiency | Korean - basic conversational | Te Reo Maori - introductory</w:t>
+        <w:t>Auckland-based | Full New Zealand driver licence | Available immediately and for business travel</w:t>
       </w:r>
     </w:p>
     <w:sectPr>

</xml_diff>

<commit_message>
Refine education and contact presentation
</commit_message>
<xml_diff>
--- a/artifacts/Nicole_Nikareayi_Public_CV.docx
+++ b/artifacts/Nicole_Nikareayi_Public_CV.docx
@@ -909,42 +909,6 @@
           <w:color w:val="12384A"/>
           <w:sz w:val="20"/>
         </w:rPr>
-        <w:t>Certificates of Attainment in Academic English - Levels 7 and 8</w:t>
-      </w:r>
-      <w:r>
-        <w:rPr>
-          <w:rFonts w:ascii="Arial" w:hAnsi="Arial"/>
-          <w:b w:val="0"/>
-          <w:i w:val="0"/>
-          <w:color w:val="1F2B31"/>
-          <w:sz w:val="18"/>
-        </w:rPr>
-        <w:t xml:space="preserve"> | University of Waikato, New Zealand</w:t>
-      </w:r>
-      <w:r>
-        <w:rPr>
-          <w:rFonts w:ascii="Arial" w:hAnsi="Arial"/>
-          <w:b w:val="0"/>
-          <w:i/>
-          <w:color w:val="4C6572"/>
-          <w:sz w:val="18"/>
-        </w:rPr>
-        <w:t xml:space="preserve"> | 2024 - 2025</w:t>
-      </w:r>
-    </w:p>
-    <w:p>
-      <w:pPr>
-        <w:keepNext/>
-        <w:spacing w:before="80" w:after="20" w:line="240" w:lineRule="auto"/>
-      </w:pPr>
-      <w:r>
-        <w:rPr>
-          <w:rFonts w:ascii="Arial" w:hAnsi="Arial"/>
-          <w:b/>
-          <w:i w:val="0"/>
-          <w:color w:val="12384A"/>
-          <w:sz w:val="20"/>
-        </w:rPr>
         <w:t>Bachelor of Management (Accounting)</w:t>
       </w:r>
       <w:r>

</xml_diff>